<commit_message>
docs: memoria con Carlos Achiquez identificado como autor (Word)
</commit_message>
<xml_diff>
--- a/docs/Memoria_Analizador_Bursatil_IA.docx
+++ b/docs/Memoria_Analizador_Bursatil_IA.docx
@@ -489,6 +489,78 @@
                 <w:sz w:val="20"/>
                 <w:szCs w:val="20"/>
               </w:rPr>
+              <w:t xml:space="preserve">Autor de esta memoria</w:t>
+            </w:r>
+          </w:p>
+        </w:tc>
+        <w:tc>
+          <w:tcPr>
+            <w:tcW w:type="dxa" w:w="6026"/>
+            <w:tcBorders>
+              <w:top w:val="single" w:color="C9C6BF" w:sz="4"/>
+              <w:left w:val="single" w:color="C9C6BF" w:sz="4"/>
+              <w:bottom w:val="single" w:color="C9C6BF" w:sz="4"/>
+              <w:right w:val="single" w:color="C9C6BF" w:sz="4"/>
+            </w:tcBorders>
+            <w:shd w:fill="F4F7F7" w:val="clear"/>
+            <w:tcMar>
+              <w:top w:type="dxa" w:w="60"/>
+              <w:left w:type="dxa" w:w="110"/>
+              <w:bottom w:type="dxa" w:w="60"/>
+              <w:right w:type="dxa" w:w="110"/>
+            </w:tcMar>
+            <w:vAlign w:val="center"/>
+          </w:tcPr>
+          <w:p>
+            <w:pPr>
+              <w:spacing w:after="0" w:line="264"/>
+            </w:pPr>
+            <w:r>
+              <w:rPr>
+                <w:rFonts w:ascii="Calibri" w:cs="Calibri" w:eastAsia="Calibri" w:hAnsi="Calibri"/>
+                <w:b w:val="false"/>
+                <w:bCs w:val="false"/>
+                <w:color w:val="28251D"/>
+                <w:sz w:val="20"/>
+                <w:szCs w:val="20"/>
+              </w:rPr>
+              <w:t xml:space="preserve">Carlos Achiquez (GitHub: Carlos1310823)</w:t>
+            </w:r>
+          </w:p>
+        </w:tc>
+      </w:tr>
+      <w:tr>
+        <w:tc>
+          <w:tcPr>
+            <w:tcW w:type="dxa" w:w="3000"/>
+            <w:tcBorders>
+              <w:top w:val="single" w:color="C9C6BF" w:sz="4"/>
+              <w:left w:val="single" w:color="C9C6BF" w:sz="4"/>
+              <w:bottom w:val="single" w:color="C9C6BF" w:sz="4"/>
+              <w:right w:val="single" w:color="C9C6BF" w:sz="4"/>
+            </w:tcBorders>
+            <w:shd w:fill="FFFFFF" w:val="clear"/>
+            <w:tcMar>
+              <w:top w:type="dxa" w:w="60"/>
+              <w:left w:type="dxa" w:w="110"/>
+              <w:bottom w:type="dxa" w:w="60"/>
+              <w:right w:type="dxa" w:w="110"/>
+            </w:tcMar>
+            <w:vAlign w:val="center"/>
+          </w:tcPr>
+          <w:p>
+            <w:pPr>
+              <w:spacing w:after="0" w:line="264"/>
+            </w:pPr>
+            <w:r>
+              <w:rPr>
+                <w:rFonts w:ascii="Calibri" w:cs="Calibri" w:eastAsia="Calibri" w:hAnsi="Calibri"/>
+                <w:b/>
+                <w:bCs/>
+                <w:color w:val="1A237E"/>
+                <w:sz w:val="20"/>
+                <w:szCs w:val="20"/>
+              </w:rPr>
               <w:t xml:space="preserve">Fecha</w:t>
             </w:r>
           </w:p>
@@ -502,7 +574,7 @@
               <w:bottom w:val="single" w:color="C9C6BF" w:sz="4"/>
               <w:right w:val="single" w:color="C9C6BF" w:sz="4"/>
             </w:tcBorders>
-            <w:shd w:fill="F4F7F7" w:val="clear"/>
+            <w:shd w:fill="FFFFFF" w:val="clear"/>
             <w:tcMar>
               <w:top w:type="dxa" w:w="60"/>
               <w:left w:type="dxa" w:w="110"/>

</xml_diff>